<commit_message>
Update canonical channel business manager resume
</commit_message>
<xml_diff>
--- a/data/resumes/JosephLamb_Resume.docx
+++ b/data/resumes/JosephLamb_Resume.docx
@@ -42,7 +42,7 @@
           <w:sz w:val="19"/>
           <w:szCs w:val="19"/>
         </w:rPr>
-        <w:t>CHANNEL SALES   |   DISTRIBUTOR &amp; PARTNER MANAGEMENT   |   MULTI-STATE TERRITORY GROWTH</w:t>
+        <w:t xml:space="preserve">CHANNEL SALES &amp; PARTNER MANAGEMENT   |   DISTRIBUTOR NETWORK PERFORMANCE   |   MULTI-STATE GROWTH</w:t>
       </w:r>
     </w:p>
     <w:p>
@@ -50,7 +50,7 @@
         <w:spacing w:after="60"/>
       </w:pPr>
       <w:r>
-        <w:t>Ten years in channel sales, growing revenue through independently owned distributor offices, outsourced retail staffing partners, and national retail chains.</w:t>
+        <w:t xml:space="preserve">Ten years in channel sales and partner management, driving growth through independently owned distributors, outsourced retail staffing partners, and national retail chains.</w:t>
       </w:r>
     </w:p>
     <w:p>
@@ -58,15 +58,7 @@
         <w:spacing w:after="60"/>
       </w:pPr>
       <w:r>
-        <w:t xml:space="preserve">Most recently ran a 161-location, four-state territory across 14 distributor offices — operating against a 15% growth mandate re-set annually for six straight </w:t>
-      </w:r>
-      <w:proofErr w:type="gramStart"/>
-      <w:r>
-        <w:t>years, and</w:t>
-      </w:r>
-      <w:proofErr w:type="gramEnd"/>
-      <w:r>
-        <w:t xml:space="preserve"> holding 100% partner retention on a paid platform in a no-contract, week-to-week billing environment despite a free carrier alternative.</w:t>
+        <w:t xml:space="preserve">Most recently led partner performance across 14 distributors and 161 locations in four states at peak, exceeding a 15% annual growth quota for six straight years while sustaining 100% distributor-partner retention on a paid platform.</w:t>
       </w:r>
     </w:p>
     <w:p>
@@ -74,7 +66,7 @@
         <w:spacing w:after="60"/>
       </w:pPr>
       <w:r>
-        <w:t>Built what didn't exist: the analytics that killed a fraud pattern, a training standard that halved partner onboarding, and an escalation workflow that protected the company's largest account.</w:t>
+        <w:t xml:space="preserve">Built the operating infrastructure behind that performance: joint business planning, partner enablement, performance analytics, and corrective action.</w:t>
       </w:r>
     </w:p>
     <w:p>
@@ -104,87 +96,7 @@
           <w:sz w:val="20"/>
           <w:szCs w:val="20"/>
         </w:rPr>
-        <w:t xml:space="preserve">Channel Partner </w:t>
-      </w:r>
-      <w:proofErr w:type="gramStart"/>
-      <w:r>
-        <w:rPr>
-          <w:sz w:val="20"/>
-          <w:szCs w:val="20"/>
-        </w:rPr>
-        <w:t>Management  ·</w:t>
-      </w:r>
-      <w:proofErr w:type="gramEnd"/>
-      <w:r>
-        <w:rPr>
-          <w:sz w:val="20"/>
-          <w:szCs w:val="20"/>
-        </w:rPr>
-        <w:t xml:space="preserve">  Joint Business </w:t>
-      </w:r>
-      <w:proofErr w:type="gramStart"/>
-      <w:r>
-        <w:rPr>
-          <w:sz w:val="20"/>
-          <w:szCs w:val="20"/>
-        </w:rPr>
-        <w:t>Planning  ·</w:t>
-      </w:r>
-      <w:proofErr w:type="gramEnd"/>
-      <w:r>
-        <w:rPr>
-          <w:sz w:val="20"/>
-          <w:szCs w:val="20"/>
-        </w:rPr>
-        <w:t xml:space="preserve">  Sell-Through </w:t>
-      </w:r>
-      <w:proofErr w:type="gramStart"/>
-      <w:r>
-        <w:rPr>
-          <w:sz w:val="20"/>
-          <w:szCs w:val="20"/>
-        </w:rPr>
-        <w:t>Performance  ·</w:t>
-      </w:r>
-      <w:proofErr w:type="gramEnd"/>
-      <w:r>
-        <w:rPr>
-          <w:sz w:val="20"/>
-          <w:szCs w:val="20"/>
-        </w:rPr>
-        <w:t xml:space="preserve">  Partner </w:t>
-      </w:r>
-      <w:proofErr w:type="gramStart"/>
-      <w:r>
-        <w:rPr>
-          <w:sz w:val="20"/>
-          <w:szCs w:val="20"/>
-        </w:rPr>
-        <w:t>Enablement  ·</w:t>
-      </w:r>
-      <w:proofErr w:type="gramEnd"/>
-      <w:r>
-        <w:rPr>
-          <w:sz w:val="20"/>
-          <w:szCs w:val="20"/>
-        </w:rPr>
-        <w:t xml:space="preserve">  Territory </w:t>
-      </w:r>
-      <w:proofErr w:type="gramStart"/>
-      <w:r>
-        <w:rPr>
-          <w:sz w:val="20"/>
-          <w:szCs w:val="20"/>
-        </w:rPr>
-        <w:t>Management  ·</w:t>
-      </w:r>
-      <w:proofErr w:type="gramEnd"/>
-      <w:r>
-        <w:rPr>
-          <w:sz w:val="20"/>
-          <w:szCs w:val="20"/>
-        </w:rPr>
-        <w:t xml:space="preserve">  Two-Tier Distribution</w:t>
+        <w:t xml:space="preserve">Channel Partner Management  ·  Joint Business Planning  ·  Partner Activation &amp; Enablement  ·  Distributor Network Performance  ·  Partner Retention  ·  Sell-Through Growth  ·  Two-Tier Distribution  ·  Performance Analytics</w:t>
       </w:r>
     </w:p>
     <w:p>
@@ -239,22 +151,10 @@
           <w:b/>
           <w:bCs/>
         </w:rPr>
-        <w:t>Field Sales Representative — Channel Sales</w:t>
-      </w:r>
-      <w:r>
-        <w:rPr>
-          <w:b/>
-          <w:bCs/>
-        </w:rPr>
-        <w:t xml:space="preserve"> </w:t>
-      </w:r>
-      <w:proofErr w:type="gramStart"/>
-      <w:r>
-        <w:t>·  MN</w:t>
-      </w:r>
-      <w:proofErr w:type="gramEnd"/>
-      <w:r>
-        <w:t xml:space="preserve"> / WI / IA / SD — 161 locations, 14 distributor offices at peak</w:t>
+        <w:t xml:space="preserve">Field Sales Representative — Channel Sales</w:t>
+      </w:r>
+      <w:r>
+        <w:t xml:space="preserve"> · MN / WI / IA / SD — 14 distributors, 161 locations at peak</w:t>
       </w:r>
     </w:p>
     <w:p>
@@ -277,7 +177,6 @@
         <w:keepNext/>
         <w:spacing w:before="80" w:after="30"/>
       </w:pPr>
-      <w:proofErr w:type="gramStart"/>
       <w:r>
         <w:rPr>
           <w:b/>
@@ -285,17 +184,7 @@
           <w:sz w:val="20"/>
           <w:szCs w:val="20"/>
         </w:rPr>
-        <w:t>BUILD  |</w:t>
-      </w:r>
-      <w:proofErr w:type="gramEnd"/>
-      <w:r>
-        <w:rPr>
-          <w:b/>
-          <w:bCs/>
-          <w:sz w:val="20"/>
-          <w:szCs w:val="20"/>
-        </w:rPr>
-        <w:t xml:space="preserve">  2019 – 2022</w:t>
+        <w:t xml:space="preserve">PARTNER GROWTH, GOVERNANCE &amp; RETENTION</w:t>
       </w:r>
     </w:p>
     <w:p>
@@ -313,18 +202,10 @@
           <w:b/>
           <w:bCs/>
         </w:rPr>
-        <w:t>$3.1M+ in Annualized Commissions Recovered:</w:t>
-      </w:r>
-      <w:r>
-        <w:t xml:space="preserve"> Every week, 200 lines went </w:t>
-      </w:r>
-      <w:proofErr w:type="spellStart"/>
-      <w:r>
-        <w:t>unactivated</w:t>
-      </w:r>
-      <w:proofErr w:type="spellEnd"/>
-      <w:r>
-        <w:t xml:space="preserve"> at the largest distributor office — a different 200 each time, worth $60K+ in weekly commissions nobody was tracking. Rolled an “Own Your Customer” outreach cadence across all five offices in the territory at the time, cutting stalled activations to under 20 per week within a month; it ran until 2025.</w:t>
+        <w:t xml:space="preserve">Joint Business Planning &amp; Partner Accountability — 14 Distributors at Peak:</w:t>
+      </w:r>
+      <w:r>
+        <w:t xml:space="preserve"> Led weekly field reviews and monthly executive operating reviews with director- and C-suite partner leaders, translating sales, compliance, and conduct gaps into corrective action plans tied to master-contract standards.</w:t>
       </w:r>
     </w:p>
     <w:p>
@@ -342,10 +223,10 @@
           <w:b/>
           <w:bCs/>
         </w:rPr>
-        <w:t>50% Reduction in Partner Training Time:</w:t>
-      </w:r>
-      <w:r>
-        <w:t xml:space="preserve"> Replaced a 10-day partner new-hire program with a five-day training and certification curriculum designed for a transactional partner model — continual new-hire flow, seller readiness, platform proficiency, compliance, and activation follow-up.</w:t>
+        <w:t xml:space="preserve">$26M+ Annualized Subscriber Revenue Across Three Sales Motions | 156% Retail Growth:</w:t>
+      </w:r>
+      <w:r>
+        <w:t xml:space="preserve"> Directed B2B, D2D, and national-retail execution across 14 distributors and 161 locations in four states; grew annual retail net phone adds from ≈5,000 to 12,800+, exceeding a 15% annual growth quota for six straight years and peaking above 22%.</w:t>
       </w:r>
     </w:p>
     <w:p>
@@ -363,10 +244,10 @@
           <w:b/>
           <w:bCs/>
         </w:rPr>
-        <w:t>300+ Rep Pilot Leadership:</w:t>
-      </w:r>
-      <w:r>
-        <w:t xml:space="preserve"> Led field adoption for a national retail pilot, onboarding 300+ partner sales representatives and translating live-user friction into workflow changes that shaped the nationwide rollout.</w:t>
+        <w:t xml:space="preserve">100% Paid-Platform Partner Retention | 1,000+ Active Users:</w:t>
+      </w:r>
+      <w:r>
+        <w:t xml:space="preserve"> Supported an active base of 1,000+ partner users on Sara+ at any given time while retaining every distributor partner for six years despite a free carrier-provided alternative.</w:t>
       </w:r>
     </w:p>
     <w:p>
@@ -384,10 +265,25 @@
           <w:b/>
           <w:bCs/>
         </w:rPr>
-        <w:t>Eliminated a Fraud Pattern Carrier Reporting Couldn't See:</w:t>
-      </w:r>
-      <w:r>
-        <w:t xml:space="preserve"> Spotted order anomalies the existing reports didn't explain and built the analysis that isolated the cause — mismatched addresses paired with no-installs. Drove adoption of an address-lock control that took that fraud type to near zero.</w:t>
+        <w:t xml:space="preserve">82% Reduction in Headquarters Escalations:</w:t>
+      </w:r>
+      <w:r>
+        <w:t xml:space="preserve"> Designed an automated post-call SMS workflow with conditional Tier-2 routing and a 24-hour SLA, cutting escalations reaching the account's headquarters by 82%. Contributed to retaining the company's largest national account, representing 46% of U.S. sales.</w:t>
+      </w:r>
+    </w:p>
+    <w:p>
+      <w:pPr>
+        <w:keepNext/>
+        <w:spacing w:before="80" w:after="30"/>
+      </w:pPr>
+      <w:r>
+        <w:rPr>
+          <w:b/>
+          <w:bCs/>
+          <w:sz w:val="20"/>
+          <w:szCs w:val="20"/>
+        </w:rPr>
+        <w:t xml:space="preserve">PARTNER ACTIVATION, ENABLEMENT &amp; OPERATING SYSTEMS</w:t>
       </w:r>
     </w:p>
     <w:p>
@@ -405,10 +301,10 @@
           <w:b/>
           <w:bCs/>
         </w:rPr>
-        <w:t>Wrote the Escalation SOP Running in Cape Town &amp; Durban:</w:t>
-      </w:r>
-      <w:r>
-        <w:t xml:space="preserve"> Dual-hatted onto a centralized escalations role in mid-2020 while keeping full territory ownership. Co-designed the triage framework and wrote the resolution content card by card in Trello for a 20-person escalations team — later the training and documentation used by hundreds of Ignition Group reps staffing the DSI account across Cape Town and Durban.</w:t>
+        <w:t xml:space="preserve">$3.1M+ in Annualized Distributor Commissions Recovered:</w:t>
+      </w:r>
+      <w:r>
+        <w:t xml:space="preserve"> At the largest distributor, 200 different lines went unactivated each week—representing $60K+ in previously untracked commissions payable only upon activation. Rolled out an “Own Your Customer” outreach cadence across all five assigned distributors at the time, cutting stalled activations to under 20 per week within one month; the process ran through 2025.</w:t>
       </w:r>
     </w:p>
     <w:p>
@@ -426,36 +322,10 @@
           <w:b/>
           <w:bCs/>
         </w:rPr>
-        <w:t>Joint Business Planning &amp; Compliance Authority — 14 Distributor Offices:</w:t>
-      </w:r>
-      <w:r>
-        <w:t xml:space="preserve"> Ran weekly in-market and monthly out-of-market operating reviews with director- and C-suite partner leadership, balancing relationship depth against master-contract accountability. Compliance and conduct findings escalated directly to AT&amp;T, which could result in permanent removal of individual representatives or entire partner offices — protecting the partners who were performing.</w:t>
-      </w:r>
-    </w:p>
-    <w:p>
-      <w:pPr>
-        <w:keepNext/>
-        <w:spacing w:before="80" w:after="30"/>
-      </w:pPr>
-      <w:proofErr w:type="gramStart"/>
-      <w:r>
-        <w:rPr>
-          <w:b/>
-          <w:bCs/>
-          <w:sz w:val="20"/>
-          <w:szCs w:val="20"/>
-        </w:rPr>
-        <w:t>SCALE  |</w:t>
-      </w:r>
-      <w:proofErr w:type="gramEnd"/>
-      <w:r>
-        <w:rPr>
-          <w:b/>
-          <w:bCs/>
-          <w:sz w:val="20"/>
-          <w:szCs w:val="20"/>
-        </w:rPr>
-        <w:t xml:space="preserve">  2023 – Apr 2026</w:t>
+        <w:t>50% Reduction in Partner Training Time:</w:t>
+      </w:r>
+      <w:r>
+        <w:t xml:space="preserve"> Replaced a 10-day partner new-hire program with a five-day training and certification curriculum designed for a transactional partner model — continual new-hire flow, seller readiness, platform proficiency, compliance, and activation follow-up.</w:t>
       </w:r>
     </w:p>
     <w:p>
@@ -473,10 +343,10 @@
           <w:b/>
           <w:bCs/>
         </w:rPr>
-        <w:t>156% Retail Growth — 5,000 to 12,800+ Annual Net Adds:</w:t>
-      </w:r>
-      <w:r>
-        <w:t xml:space="preserve"> Directed B2B, D2D, and national-retail execution across 14 distributor offices and 161 locations in four states, against a 15% growth mandate re-set every year for six years, with peaks above 22%. Retail — the smallest of the three motions — carried roughly $8.7M in annualized subscriber revenue at AT&amp;T's published ARPU.</w:t>
+        <w:t>300+ Rep Pilot Leadership:</w:t>
+      </w:r>
+      <w:r>
+        <w:t xml:space="preserve"> Led field adoption for a national retail pilot, onboarding 300+ partner sales representatives and translating live-user friction into workflow changes that shaped the nationwide rollout.</w:t>
       </w:r>
     </w:p>
     <w:p>
@@ -494,10 +364,10 @@
           <w:b/>
           <w:bCs/>
         </w:rPr>
-        <w:t>100% Platform Retention:</w:t>
-      </w:r>
-      <w:r>
-        <w:t xml:space="preserve"> Held 100% distributor-partner retention on a paid SaaS platform over six years — no contract, week-to-week billing, against a free carrier-provided alternative.</w:t>
+        <w:t xml:space="preserve">Drove a Fraud Pattern to Near Zero:</w:t>
+      </w:r>
+      <w:r>
+        <w:t xml:space="preserve"> Spotted order anomalies carrier reporting couldn't explain and built the analysis that isolated mismatched addresses paired with no-installs as the cause. Secured adoption of an address-lock control.</w:t>
       </w:r>
     </w:p>
     <w:p>
@@ -515,10 +385,10 @@
           <w:b/>
           <w:bCs/>
         </w:rPr>
-        <w:t>82% Escalation Reduction | 46%-of-Sales Account Retention:</w:t>
-      </w:r>
-      <w:r>
-        <w:t xml:space="preserve"> Designed an automated post-call SMS workflow with conditional Tier-2 routing and a 24-hour SLA. Cut escalations reaching the account's headquarters by 82% and contributed to retaining the company's largest national account — 46% of U.S. sales.</w:t>
+        <w:t>Wrote the Escalation SOP Running in Cape Town &amp; Durban:</w:t>
+      </w:r>
+      <w:r>
+        <w:t xml:space="preserve"> Dual-hatted onto a centralized escalations role in mid-2020 while keeping full territory ownership. Co-designed the triage framework and wrote the resolution content card by card in Trello for a 20-person escalations team — later the training and documentation used by hundreds of Ignition Group reps staffing the DSI account across Cape Town and Durban.</w:t>
       </w:r>
     </w:p>
     <w:p>
@@ -596,10 +466,10 @@
           <w:b/>
           <w:bCs/>
         </w:rPr>
-        <w:t>Delivered 57% of Wisconsin's Market Growth from 31% of Its Volume:</w:t>
-      </w:r>
-      <w:r>
-        <w:t xml:space="preserve"> Managed three Pepsi distribution branches totaling 94,578 annual cases, generating 7,701 of the market's 13,434 incremental cases.</w:t>
+        <w:t xml:space="preserve">Delivered 57% of Wisconsin's Market Growth from 31% of Its Volume:</w:t>
+      </w:r>
+      <w:r>
+        <w:t xml:space="preserve"> Directed territory growth through three Pepsi distribution branches totaling 94,578 annual cases, generating 7,701 of the market's 13,434 incremental cases.</w:t>
       </w:r>
     </w:p>
     <w:p>

</xml_diff>